<commit_message>
Payment update - chưa clear cart
</commit_message>
<xml_diff>
--- a/analysis/GreenLifeStore.docx
+++ b/analysis/GreenLifeStore.docx
@@ -28,71 +28,81 @@
         <w:lastRenderedPageBreak/>
         <w:t>MỞ ĐẦU</w:t>
       </w:r>
+    </w:p>
+    <w:p>
+      <w:pPr>
+        <w:pStyle w:val="Style1"/>
+        <w:jc w:val="left"/>
+      </w:pPr>
+    </w:p>
+    <w:p/>
+    <w:p/>
+    <w:p>
+      <w:pPr>
+        <w:spacing w:after="160" w:line="259" w:lineRule="auto"/>
+      </w:pPr>
+      <w:r>
+        <w:br w:type="page"/>
+      </w:r>
+    </w:p>
+    <w:p/>
+    <w:p>
+      <w:pPr>
+        <w:pStyle w:val="Heading1"/>
+      </w:pPr>
+      <w:r>
+        <w:t>GIỚI THIỆU &amp; TỔNG QUAN THƯƠNG MẠI ĐIỆN TỬ</w:t>
+      </w:r>
+    </w:p>
+    <w:p/>
+    <w:p>
+      <w:pPr>
+        <w:pStyle w:val="Heading2"/>
+      </w:pPr>
+      <w:r>
+        <w:t>Khái niệm TMĐT</w:t>
+      </w:r>
+      <w:r>
+        <w:t>:</w:t>
+      </w:r>
+    </w:p>
+    <w:p/>
+    <w:p>
+      <w:pPr>
+        <w:pStyle w:val="Heading2"/>
+      </w:pPr>
+      <w:r>
+        <w:t>Vai trò của TMĐT trong kinh doanh hiện đại</w:t>
+      </w:r>
+      <w:r>
+        <w:t>:</w:t>
+      </w:r>
+    </w:p>
+    <w:p/>
+    <w:p>
+      <w:pPr>
+        <w:pStyle w:val="Heading2"/>
+      </w:pPr>
+      <w:r>
+        <w:t>Giới thiệu case GreenLife Store</w:t>
+      </w:r>
+      <w:r>
+        <w:t>:</w:t>
+      </w:r>
+    </w:p>
+    <w:p>
+      <w:r>
+        <w:t>Mô tả chung về doanh nghiệp,tình hình kinh doanh hiện tại, mục</w:t>
+      </w:r>
+      <w:r>
+        <w:t xml:space="preserve"> </w:t>
+      </w:r>
       <w:bookmarkStart w:id="0" w:name="_GoBack"/>
       <w:bookmarkEnd w:id="0"/>
-    </w:p>
-    <w:p>
-      <w:pPr>
-        <w:pStyle w:val="Style1"/>
-        <w:jc w:val="left"/>
-      </w:pPr>
-    </w:p>
-    <w:p/>
-    <w:p/>
-    <w:p>
-      <w:pPr>
-        <w:spacing w:after="160" w:line="259" w:lineRule="auto"/>
-      </w:pPr>
-      <w:r>
-        <w:br w:type="page"/>
-      </w:r>
-    </w:p>
-    <w:p/>
-    <w:p>
-      <w:pPr>
-        <w:pStyle w:val="Heading1"/>
-      </w:pPr>
-      <w:r>
-        <w:t>GIỚI THIỆU &amp; TỔNG QUAN THƯƠNG MẠI ĐIỆN TỬ</w:t>
-      </w:r>
-    </w:p>
-    <w:p/>
-    <w:p>
-      <w:pPr>
-        <w:pStyle w:val="Heading2"/>
-      </w:pPr>
-      <w:r>
-        <w:t>Khái niệm TMĐT</w:t>
-      </w:r>
-      <w:r>
-        <w:t>:</w:t>
-      </w:r>
-    </w:p>
-    <w:p/>
-    <w:p>
-      <w:pPr>
-        <w:pStyle w:val="Heading2"/>
-      </w:pPr>
-      <w:r>
-        <w:t>Vai trò của TMĐT trong kinh doanh hiện đại</w:t>
-      </w:r>
-      <w:r>
-        <w:t>:</w:t>
-      </w:r>
-    </w:p>
-    <w:p/>
-    <w:p>
-      <w:pPr>
-        <w:pStyle w:val="Heading2"/>
-      </w:pPr>
-      <w:r>
-        <w:t>Giới thiệu case GreenLife Store</w:t>
-      </w:r>
-      <w:r>
-        <w:t>:</w:t>
-      </w:r>
-    </w:p>
-    <w:p/>
+      <w:r>
+        <w:t>tiêu tương lai, lý do cần thiết xây dựng hệ thống TMĐT (giả định)</w:t>
+      </w:r>
+    </w:p>
     <w:p>
       <w:r>
         <w:br w:type="page"/>

</xml_diff>

<commit_message>
update doc bao cao
</commit_message>
<xml_diff>
--- a/analysis/GreenLifeStore.docx
+++ b/analysis/GreenLifeStore.docx
@@ -1,6 +1,6 @@
 
 <file path=word/document.xml><?xml version="1.0" encoding="utf-8"?>
-<w:document xmlns:wpc="http://schemas.microsoft.com/office/word/2010/wordprocessingCanvas" xmlns:cx="http://schemas.microsoft.com/office/drawing/2014/chartex" xmlns:cx1="http://schemas.microsoft.com/office/drawing/2015/9/8/chartex" xmlns:cx2="http://schemas.microsoft.com/office/drawing/2015/10/21/chartex" xmlns:cx3="http://schemas.microsoft.com/office/drawing/2016/5/9/chartex" xmlns:cx4="http://schemas.microsoft.com/office/drawing/2016/5/10/chartex" xmlns:cx5="http://schemas.microsoft.com/office/drawing/2016/5/11/chartex" xmlns:cx6="http://schemas.microsoft.com/office/drawing/2016/5/12/chartex" xmlns:cx7="http://schemas.microsoft.com/office/drawing/2016/5/13/chartex" xmlns:cx8="http://schemas.microsoft.com/office/drawing/2016/5/14/chartex" xmlns:mc="http://schemas.openxmlformats.org/markup-compatibility/2006" xmlns:aink="http://schemas.microsoft.com/office/drawing/2016/ink" xmlns:am3d="http://schemas.microsoft.com/office/drawing/2017/model3d" xmlns:o="urn:schemas-microsoft-com:office:office" xmlns:r="http://schemas.openxmlformats.org/officeDocument/2006/relationships" xmlns:m="http://schemas.openxmlformats.org/officeDocument/2006/math" xmlns:v="urn:schemas-microsoft-com:vml" xmlns:wp14="http://schemas.microsoft.com/office/word/2010/wordprocessingDrawing" xmlns:wp="http://schemas.openxmlformats.org/drawingml/2006/wordprocessingDrawing" xmlns:w10="urn:schemas-microsoft-com:office:word" xmlns:w="http://schemas.openxmlformats.org/wordprocessingml/2006/main" xmlns:w14="http://schemas.microsoft.com/office/word/2010/wordml" xmlns:w15="http://schemas.microsoft.com/office/word/2012/wordml" xmlns:w16cid="http://schemas.microsoft.com/office/word/2016/wordml/cid" xmlns:w16se="http://schemas.microsoft.com/office/word/2015/wordml/symex" xmlns:wpg="http://schemas.microsoft.com/office/word/2010/wordprocessingGroup" xmlns:wpi="http://schemas.microsoft.com/office/word/2010/wordprocessingInk" xmlns:wne="http://schemas.microsoft.com/office/word/2006/wordml" xmlns:wps="http://schemas.microsoft.com/office/word/2010/wordprocessingShape" mc:Ignorable="w14 w15 w16se w16cid wp14">
+<w:document xmlns:wpc="http://schemas.microsoft.com/office/word/2010/wordprocessingCanvas" xmlns:cx="http://schemas.microsoft.com/office/drawing/2014/chartex" xmlns:cx1="http://schemas.microsoft.com/office/drawing/2015/9/8/chartex" xmlns:cx2="http://schemas.microsoft.com/office/drawing/2015/10/21/chartex" xmlns:cx3="http://schemas.microsoft.com/office/drawing/2016/5/9/chartex" xmlns:cx4="http://schemas.microsoft.com/office/drawing/2016/5/10/chartex" xmlns:cx5="http://schemas.microsoft.com/office/drawing/2016/5/11/chartex" xmlns:cx6="http://schemas.microsoft.com/office/drawing/2016/5/12/chartex" xmlns:cx7="http://schemas.microsoft.com/office/drawing/2016/5/13/chartex" xmlns:cx8="http://schemas.microsoft.com/office/drawing/2016/5/14/chartex" xmlns:mc="http://schemas.openxmlformats.org/markup-compatibility/2006" xmlns:aink="http://schemas.microsoft.com/office/drawing/2016/ink" xmlns:am3d="http://schemas.microsoft.com/office/drawing/2017/model3d" xmlns:o="urn:schemas-microsoft-com:office:office" xmlns:oel="http://schemas.microsoft.com/office/2019/extlst" xmlns:r="http://schemas.openxmlformats.org/officeDocument/2006/relationships" xmlns:m="http://schemas.openxmlformats.org/officeDocument/2006/math" xmlns:v="urn:schemas-microsoft-com:vml" xmlns:wp14="http://schemas.microsoft.com/office/word/2010/wordprocessingDrawing" xmlns:wp="http://schemas.openxmlformats.org/drawingml/2006/wordprocessingDrawing" xmlns:w10="urn:schemas-microsoft-com:office:word" xmlns:w="http://schemas.openxmlformats.org/wordprocessingml/2006/main" xmlns:w14="http://schemas.microsoft.com/office/word/2010/wordml" xmlns:w15="http://schemas.microsoft.com/office/word/2012/wordml" xmlns:w16cex="http://schemas.microsoft.com/office/word/2018/wordml/cex" xmlns:w16cid="http://schemas.microsoft.com/office/word/2016/wordml/cid" xmlns:w16="http://schemas.microsoft.com/office/word/2018/wordml" xmlns:w16du="http://schemas.microsoft.com/office/word/2023/wordml/word16du" xmlns:w16sdtdh="http://schemas.microsoft.com/office/word/2020/wordml/sdtdatahash" xmlns:w16sdtfl="http://schemas.microsoft.com/office/word/2024/wordml/sdtformatlock" xmlns:w16se="http://schemas.microsoft.com/office/word/2015/wordml/symex" xmlns:wpg="http://schemas.microsoft.com/office/word/2010/wordprocessingGroup" xmlns:wpi="http://schemas.microsoft.com/office/word/2010/wordprocessingInk" xmlns:wne="http://schemas.microsoft.com/office/word/2006/wordml" xmlns:wps="http://schemas.microsoft.com/office/word/2010/wordprocessingShape" mc:Ignorable="w14 w15 w16se w16cid w16 w16cex w16sdtdh w16sdtfl w16du wp14">
   <w:body>
     <w:p>
       <w:pPr>
@@ -62,7 +62,7 @@
                     <pic:cNvPicPr preferRelativeResize="0"/>
                   </pic:nvPicPr>
                   <pic:blipFill>
-                    <a:blip r:embed="rId5">
+                    <a:blip r:embed="rId7">
                       <a:extLst>
                         <a:ext uri="{28A0092B-C50C-407E-A947-70E740481C1C}">
                           <a14:useLocalDpi xmlns:a14="http://schemas.microsoft.com/office/drawing/2010/main" val="0"/>
@@ -145,7 +145,12 @@
           <w:b/>
         </w:rPr>
         <w:br/>
-        <w:t>APP ĐẶT SÂN THỂ THAO</w:t>
+      </w:r>
+      <w:r>
+        <w:rPr>
+          <w:b/>
+        </w:rPr>
+        <w:t>WEBSITE BÁN HÀNG ĐỒ TÁI CHẾ</w:t>
       </w:r>
     </w:p>
     <w:p>
@@ -159,7 +164,13 @@
         <w:rPr>
           <w:b/>
         </w:rPr>
-        <w:t>Giảng viên: Phạm Thi Vương</w:t>
+        <w:t xml:space="preserve">Giảng viên: </w:t>
+      </w:r>
+      <w:r>
+        <w:rPr>
+          <w:b/>
+        </w:rPr>
+        <w:t>Hoàng Mạnh Hà</w:t>
       </w:r>
     </w:p>
     <w:p/>
@@ -180,7 +191,7 @@
         <w:rPr>
           <w:b/>
         </w:rPr>
-        <w:t>6</w:t>
+        <w:t>11</w:t>
       </w:r>
       <w:r>
         <w:br/>
@@ -211,19 +222,19 @@
         <w:tab/>
       </w:r>
       <w:r>
-        <w:t>3123560015</w:t>
+        <w:t>3123560096</w:t>
       </w:r>
       <w:r>
         <w:tab/>
       </w:r>
       <w:r>
-        <w:t>Đỗ Thành Đạt</w:t>
+        <w:t>Nguyễn Quang Vĩnh</w:t>
       </w:r>
       <w:r>
         <w:tab/>
       </w:r>
       <w:r>
-        <w:t>DKP1232</w:t>
+        <w:t>DKP1231</w:t>
       </w:r>
     </w:p>
     <w:p>
@@ -239,19 +250,22 @@
         <w:tab/>
       </w:r>
       <w:r>
-        <w:t>3123560066</w:t>
+        <w:t>31235600</w:t>
+      </w:r>
+      <w:r>
+        <w:t>65</w:t>
       </w:r>
       <w:r>
         <w:tab/>
       </w:r>
       <w:r>
-        <w:t>Nguyễn Trọng Phúc</w:t>
+        <w:t>Nguyễn Hồng Phúc</w:t>
       </w:r>
       <w:r>
         <w:tab/>
       </w:r>
       <w:r>
-        <w:t>DKP1231</w:t>
+        <w:t>DKP1232</w:t>
       </w:r>
     </w:p>
     <w:p>
@@ -267,13 +281,13 @@
         <w:tab/>
       </w:r>
       <w:r>
-        <w:t>3123560076</w:t>
+        <w:t>3123560066</w:t>
       </w:r>
       <w:r>
         <w:tab/>
       </w:r>
       <w:r>
-        <w:t>Hoàng Phương Sang</w:t>
+        <w:t>Nguyễn Trọng Phúc</w:t>
       </w:r>
       <w:r>
         <w:tab/>
@@ -295,13 +309,13 @@
         <w:tab/>
       </w:r>
       <w:r>
-        <w:t>3123560096</w:t>
+        <w:t>3123560076</w:t>
       </w:r>
       <w:r>
         <w:tab/>
       </w:r>
       <w:r>
-        <w:t>Nguyễn Quang Vĩnh</w:t>
+        <w:t>Hoàng Phương Sang</w:t>
       </w:r>
       <w:r>
         <w:tab/>
@@ -313,15 +327,99 @@
     <w:p>
       <w:pPr>
         <w:tabs>
-          <w:tab w:val="left" w:pos="2610"/>
-          <w:tab w:val="left" w:pos="5310"/>
+          <w:tab w:val="left" w:pos="1440"/>
+          <w:tab w:val="left" w:leader="dot" w:pos="3600"/>
+          <w:tab w:val="left" w:leader="dot" w:pos="3870"/>
+          <w:tab w:val="left" w:leader="dot" w:pos="6480"/>
         </w:tabs>
       </w:pPr>
+      <w:r>
+        <w:tab/>
+      </w:r>
+      <w:r>
+        <w:t>312356</w:t>
+      </w:r>
+      <w:r>
+        <w:t>0</w:t>
+      </w:r>
+      <w:r>
+        <w:t>079</w:t>
+      </w:r>
+      <w:r>
+        <w:tab/>
+      </w:r>
+      <w:r>
+        <w:t>Phan Vĩnh Thái</w:t>
+      </w:r>
+      <w:r>
+        <w:tab/>
+      </w:r>
+      <w:r>
+        <w:t>DKP123</w:t>
+      </w:r>
+      <w:r>
+        <w:t>2</w:t>
+      </w:r>
+    </w:p>
+    <w:p>
+      <w:pPr>
+        <w:tabs>
+          <w:tab w:val="left" w:pos="1440"/>
+          <w:tab w:val="left" w:leader="dot" w:pos="3600"/>
+          <w:tab w:val="left" w:leader="dot" w:pos="3870"/>
+          <w:tab w:val="left" w:leader="dot" w:pos="6480"/>
+        </w:tabs>
+      </w:pPr>
+      <w:r>
+        <w:tab/>
+        <w:t>31236</w:t>
+      </w:r>
+      <w:r>
+        <w:t>0</w:t>
+      </w:r>
+      <w:r>
+        <w:t>00</w:t>
+      </w:r>
+      <w:r>
+        <w:t>5</w:t>
+      </w:r>
+      <w:r>
+        <w:t>9</w:t>
+      </w:r>
+      <w:r>
+        <w:tab/>
+      </w:r>
+      <w:r>
+        <w:t>La Tấn Phát</w:t>
+      </w:r>
+      <w:r>
+        <w:tab/>
+      </w:r>
+      <w:r>
+        <w:t>DKP123</w:t>
+      </w:r>
+      <w:r>
+        <w:t>1</w:t>
+      </w:r>
+    </w:p>
+    <w:p>
+      <w:pPr>
+        <w:tabs>
+          <w:tab w:val="left" w:pos="1440"/>
+          <w:tab w:val="left" w:leader="dot" w:pos="3600"/>
+          <w:tab w:val="left" w:leader="dot" w:pos="3870"/>
+          <w:tab w:val="left" w:leader="dot" w:pos="6480"/>
+        </w:tabs>
+        <w:rPr>
+          <w:b/>
+          <w:bCs/>
+        </w:rPr>
+      </w:pPr>
     </w:p>
     <w:p>
       <w:pPr>
         <w:sectPr>
-          <w:footerReference w:type="default" r:id="rId6"/>
+          <w:footerReference w:type="default" r:id="rId8"/>
           <w:pgSz w:w="12240" w:h="15840"/>
           <w:pgMar w:top="1417" w:right="1417" w:bottom="1417" w:left="1701" w:header="720" w:footer="720" w:gutter="0"/>
           <w:pgBorders w:display="firstPage" w:offsetFrom="page">
@@ -6036,8 +6134,6 @@
       <w:r>
         <w:t>nhằm góp phần thúc đẩy xu hướng tiêu dùng bền vững trong cộng đồng.</w:t>
       </w:r>
-      <w:bookmarkStart w:id="0" w:name="_GoBack"/>
-      <w:bookmarkEnd w:id="0"/>
     </w:p>
     <w:sectPr>
       <w:pgSz w:w="12240" w:h="15840"/>
@@ -6049,8 +6145,33 @@
 </w:document>
 </file>
 
+<file path=word/endnotes.xml><?xml version="1.0" encoding="utf-8"?>
+<w:endnotes xmlns:wpc="http://schemas.microsoft.com/office/word/2010/wordprocessingCanvas" xmlns:cx="http://schemas.microsoft.com/office/drawing/2014/chartex" xmlns:cx1="http://schemas.microsoft.com/office/drawing/2015/9/8/chartex" xmlns:cx2="http://schemas.microsoft.com/office/drawing/2015/10/21/chartex" xmlns:cx3="http://schemas.microsoft.com/office/drawing/2016/5/9/chartex" xmlns:cx4="http://schemas.microsoft.com/office/drawing/2016/5/10/chartex" xmlns:cx5="http://schemas.microsoft.com/office/drawing/2016/5/11/chartex" xmlns:cx6="http://schemas.microsoft.com/office/drawing/2016/5/12/chartex" xmlns:cx7="http://schemas.microsoft.com/office/drawing/2016/5/13/chartex" xmlns:cx8="http://schemas.microsoft.com/office/drawing/2016/5/14/chartex" xmlns:mc="http://schemas.openxmlformats.org/markup-compatibility/2006" xmlns:aink="http://schemas.microsoft.com/office/drawing/2016/ink" xmlns:am3d="http://schemas.microsoft.com/office/drawing/2017/model3d" xmlns:o="urn:schemas-microsoft-com:office:office" xmlns:oel="http://schemas.microsoft.com/office/2019/extlst" xmlns:r="http://schemas.openxmlformats.org/officeDocument/2006/relationships" xmlns:m="http://schemas.openxmlformats.org/officeDocument/2006/math" xmlns:v="urn:schemas-microsoft-com:vml" xmlns:wp14="http://schemas.microsoft.com/office/word/2010/wordprocessingDrawing" xmlns:wp="http://schemas.openxmlformats.org/drawingml/2006/wordprocessingDrawing" xmlns:w10="urn:schemas-microsoft-com:office:word" xmlns:w="http://schemas.openxmlformats.org/wordprocessingml/2006/main" xmlns:w14="http://schemas.microsoft.com/office/word/2010/wordml" xmlns:w15="http://schemas.microsoft.com/office/word/2012/wordml" xmlns:w16cex="http://schemas.microsoft.com/office/word/2018/wordml/cex" xmlns:w16cid="http://schemas.microsoft.com/office/word/2016/wordml/cid" xmlns:w16="http://schemas.microsoft.com/office/word/2018/wordml" xmlns:w16du="http://schemas.microsoft.com/office/word/2023/wordml/word16du" xmlns:w16sdtdh="http://schemas.microsoft.com/office/word/2020/wordml/sdtdatahash" xmlns:w16sdtfl="http://schemas.microsoft.com/office/word/2024/wordml/sdtformatlock" xmlns:w16se="http://schemas.microsoft.com/office/word/2015/wordml/symex" xmlns:wpg="http://schemas.microsoft.com/office/word/2010/wordprocessingGroup" xmlns:wpi="http://schemas.microsoft.com/office/word/2010/wordprocessingInk" xmlns:wne="http://schemas.microsoft.com/office/word/2006/wordml" xmlns:wps="http://schemas.microsoft.com/office/word/2010/wordprocessingShape" mc:Ignorable="w14 w15 w16se w16cid w16 w16cex w16sdtdh w16sdtfl w16du wp14">
+  <w:endnote w:type="separator" w:id="-1">
+    <w:p>
+      <w:pPr>
+        <w:spacing w:line="240" w:lineRule="auto"/>
+      </w:pPr>
+      <w:r>
+        <w:separator/>
+      </w:r>
+    </w:p>
+  </w:endnote>
+  <w:endnote w:type="continuationSeparator" w:id="0">
+    <w:p>
+      <w:pPr>
+        <w:spacing w:line="240" w:lineRule="auto"/>
+      </w:pPr>
+      <w:r>
+        <w:continuationSeparator/>
+      </w:r>
+    </w:p>
+  </w:endnote>
+</w:endnotes>
+</file>
+
 <file path=word/footer1.xml><?xml version="1.0" encoding="utf-8"?>
-<w:ftr xmlns:wpc="http://schemas.microsoft.com/office/word/2010/wordprocessingCanvas" xmlns:cx="http://schemas.microsoft.com/office/drawing/2014/chartex" xmlns:cx1="http://schemas.microsoft.com/office/drawing/2015/9/8/chartex" xmlns:cx2="http://schemas.microsoft.com/office/drawing/2015/10/21/chartex" xmlns:cx3="http://schemas.microsoft.com/office/drawing/2016/5/9/chartex" xmlns:cx4="http://schemas.microsoft.com/office/drawing/2016/5/10/chartex" xmlns:cx5="http://schemas.microsoft.com/office/drawing/2016/5/11/chartex" xmlns:cx6="http://schemas.microsoft.com/office/drawing/2016/5/12/chartex" xmlns:cx7="http://schemas.microsoft.com/office/drawing/2016/5/13/chartex" xmlns:cx8="http://schemas.microsoft.com/office/drawing/2016/5/14/chartex" xmlns:mc="http://schemas.openxmlformats.org/markup-compatibility/2006" xmlns:aink="http://schemas.microsoft.com/office/drawing/2016/ink" xmlns:am3d="http://schemas.microsoft.com/office/drawing/2017/model3d" xmlns:o="urn:schemas-microsoft-com:office:office" xmlns:r="http://schemas.openxmlformats.org/officeDocument/2006/relationships" xmlns:m="http://schemas.openxmlformats.org/officeDocument/2006/math" xmlns:v="urn:schemas-microsoft-com:vml" xmlns:wp14="http://schemas.microsoft.com/office/word/2010/wordprocessingDrawing" xmlns:wp="http://schemas.openxmlformats.org/drawingml/2006/wordprocessingDrawing" xmlns:w10="urn:schemas-microsoft-com:office:word" xmlns:w="http://schemas.openxmlformats.org/wordprocessingml/2006/main" xmlns:w14="http://schemas.microsoft.com/office/word/2010/wordml" xmlns:w15="http://schemas.microsoft.com/office/word/2012/wordml" xmlns:w16cid="http://schemas.microsoft.com/office/word/2016/wordml/cid" xmlns:w16se="http://schemas.microsoft.com/office/word/2015/wordml/symex" xmlns:wpg="http://schemas.microsoft.com/office/word/2010/wordprocessingGroup" xmlns:wpi="http://schemas.microsoft.com/office/word/2010/wordprocessingInk" xmlns:wne="http://schemas.microsoft.com/office/word/2006/wordml" xmlns:wps="http://schemas.microsoft.com/office/word/2010/wordprocessingShape" mc:Ignorable="w14 w15 w16se w16cid wp14">
+<w:ftr xmlns:wpc="http://schemas.microsoft.com/office/word/2010/wordprocessingCanvas" xmlns:cx="http://schemas.microsoft.com/office/drawing/2014/chartex" xmlns:cx1="http://schemas.microsoft.com/office/drawing/2015/9/8/chartex" xmlns:cx2="http://schemas.microsoft.com/office/drawing/2015/10/21/chartex" xmlns:cx3="http://schemas.microsoft.com/office/drawing/2016/5/9/chartex" xmlns:cx4="http://schemas.microsoft.com/office/drawing/2016/5/10/chartex" xmlns:cx5="http://schemas.microsoft.com/office/drawing/2016/5/11/chartex" xmlns:cx6="http://schemas.microsoft.com/office/drawing/2016/5/12/chartex" xmlns:cx7="http://schemas.microsoft.com/office/drawing/2016/5/13/chartex" xmlns:cx8="http://schemas.microsoft.com/office/drawing/2016/5/14/chartex" xmlns:mc="http://schemas.openxmlformats.org/markup-compatibility/2006" xmlns:aink="http://schemas.microsoft.com/office/drawing/2016/ink" xmlns:am3d="http://schemas.microsoft.com/office/drawing/2017/model3d" xmlns:o="urn:schemas-microsoft-com:office:office" xmlns:oel="http://schemas.microsoft.com/office/2019/extlst" xmlns:r="http://schemas.openxmlformats.org/officeDocument/2006/relationships" xmlns:m="http://schemas.openxmlformats.org/officeDocument/2006/math" xmlns:v="urn:schemas-microsoft-com:vml" xmlns:wp14="http://schemas.microsoft.com/office/word/2010/wordprocessingDrawing" xmlns:wp="http://schemas.openxmlformats.org/drawingml/2006/wordprocessingDrawing" xmlns:w10="urn:schemas-microsoft-com:office:word" xmlns:w="http://schemas.openxmlformats.org/wordprocessingml/2006/main" xmlns:w14="http://schemas.microsoft.com/office/word/2010/wordml" xmlns:w15="http://schemas.microsoft.com/office/word/2012/wordml" xmlns:w16cex="http://schemas.microsoft.com/office/word/2018/wordml/cex" xmlns:w16cid="http://schemas.microsoft.com/office/word/2016/wordml/cid" xmlns:w16="http://schemas.microsoft.com/office/word/2018/wordml" xmlns:w16du="http://schemas.microsoft.com/office/word/2023/wordml/word16du" xmlns:w16sdtdh="http://schemas.microsoft.com/office/word/2020/wordml/sdtdatahash" xmlns:w16sdtfl="http://schemas.microsoft.com/office/word/2024/wordml/sdtformatlock" xmlns:w16se="http://schemas.microsoft.com/office/word/2015/wordml/symex" xmlns:wpg="http://schemas.microsoft.com/office/word/2010/wordprocessingGroup" xmlns:wpi="http://schemas.microsoft.com/office/word/2010/wordprocessingInk" xmlns:wne="http://schemas.microsoft.com/office/word/2006/wordml" xmlns:wps="http://schemas.microsoft.com/office/word/2010/wordprocessingShape" mc:Ignorable="w14 w15 w16se w16cid w16 w16cex w16sdtdh w16sdtfl w16du wp14">
   <w:p>
     <w:pPr>
       <w:pStyle w:val="Footer"/>
@@ -6065,8 +6186,33 @@
 </w:ftr>
 </file>
 
+<file path=word/footnotes.xml><?xml version="1.0" encoding="utf-8"?>
+<w:footnotes xmlns:wpc="http://schemas.microsoft.com/office/word/2010/wordprocessingCanvas" xmlns:cx="http://schemas.microsoft.com/office/drawing/2014/chartex" xmlns:cx1="http://schemas.microsoft.com/office/drawing/2015/9/8/chartex" xmlns:cx2="http://schemas.microsoft.com/office/drawing/2015/10/21/chartex" xmlns:cx3="http://schemas.microsoft.com/office/drawing/2016/5/9/chartex" xmlns:cx4="http://schemas.microsoft.com/office/drawing/2016/5/10/chartex" xmlns:cx5="http://schemas.microsoft.com/office/drawing/2016/5/11/chartex" xmlns:cx6="http://schemas.microsoft.com/office/drawing/2016/5/12/chartex" xmlns:cx7="http://schemas.microsoft.com/office/drawing/2016/5/13/chartex" xmlns:cx8="http://schemas.microsoft.com/office/drawing/2016/5/14/chartex" xmlns:mc="http://schemas.openxmlformats.org/markup-compatibility/2006" xmlns:aink="http://schemas.microsoft.com/office/drawing/2016/ink" xmlns:am3d="http://schemas.microsoft.com/office/drawing/2017/model3d" xmlns:o="urn:schemas-microsoft-com:office:office" xmlns:oel="http://schemas.microsoft.com/office/2019/extlst" xmlns:r="http://schemas.openxmlformats.org/officeDocument/2006/relationships" xmlns:m="http://schemas.openxmlformats.org/officeDocument/2006/math" xmlns:v="urn:schemas-microsoft-com:vml" xmlns:wp14="http://schemas.microsoft.com/office/word/2010/wordprocessingDrawing" xmlns:wp="http://schemas.openxmlformats.org/drawingml/2006/wordprocessingDrawing" xmlns:w10="urn:schemas-microsoft-com:office:word" xmlns:w="http://schemas.openxmlformats.org/wordprocessingml/2006/main" xmlns:w14="http://schemas.microsoft.com/office/word/2010/wordml" xmlns:w15="http://schemas.microsoft.com/office/word/2012/wordml" xmlns:w16cex="http://schemas.microsoft.com/office/word/2018/wordml/cex" xmlns:w16cid="http://schemas.microsoft.com/office/word/2016/wordml/cid" xmlns:w16="http://schemas.microsoft.com/office/word/2018/wordml" xmlns:w16du="http://schemas.microsoft.com/office/word/2023/wordml/word16du" xmlns:w16sdtdh="http://schemas.microsoft.com/office/word/2020/wordml/sdtdatahash" xmlns:w16sdtfl="http://schemas.microsoft.com/office/word/2024/wordml/sdtformatlock" xmlns:w16se="http://schemas.microsoft.com/office/word/2015/wordml/symex" xmlns:wpg="http://schemas.microsoft.com/office/word/2010/wordprocessingGroup" xmlns:wpi="http://schemas.microsoft.com/office/word/2010/wordprocessingInk" xmlns:wne="http://schemas.microsoft.com/office/word/2006/wordml" xmlns:wps="http://schemas.microsoft.com/office/word/2010/wordprocessingShape" mc:Ignorable="w14 w15 w16se w16cid w16 w16cex w16sdtdh w16sdtfl w16du wp14">
+  <w:footnote w:type="separator" w:id="-1">
+    <w:p>
+      <w:pPr>
+        <w:spacing w:line="240" w:lineRule="auto"/>
+      </w:pPr>
+      <w:r>
+        <w:separator/>
+      </w:r>
+    </w:p>
+  </w:footnote>
+  <w:footnote w:type="continuationSeparator" w:id="0">
+    <w:p>
+      <w:pPr>
+        <w:spacing w:line="240" w:lineRule="auto"/>
+      </w:pPr>
+      <w:r>
+        <w:continuationSeparator/>
+      </w:r>
+    </w:p>
+  </w:footnote>
+</w:footnotes>
+</file>
+
 <file path=word/numbering.xml><?xml version="1.0" encoding="utf-8"?>
-<w:numbering xmlns:wpc="http://schemas.microsoft.com/office/word/2010/wordprocessingCanvas" xmlns:cx="http://schemas.microsoft.com/office/drawing/2014/chartex" xmlns:cx1="http://schemas.microsoft.com/office/drawing/2015/9/8/chartex" xmlns:cx2="http://schemas.microsoft.com/office/drawing/2015/10/21/chartex" xmlns:cx3="http://schemas.microsoft.com/office/drawing/2016/5/9/chartex" xmlns:cx4="http://schemas.microsoft.com/office/drawing/2016/5/10/chartex" xmlns:cx5="http://schemas.microsoft.com/office/drawing/2016/5/11/chartex" xmlns:cx6="http://schemas.microsoft.com/office/drawing/2016/5/12/chartex" xmlns:cx7="http://schemas.microsoft.com/office/drawing/2016/5/13/chartex" xmlns:cx8="http://schemas.microsoft.com/office/drawing/2016/5/14/chartex" xmlns:mc="http://schemas.openxmlformats.org/markup-compatibility/2006" xmlns:aink="http://schemas.microsoft.com/office/drawing/2016/ink" xmlns:am3d="http://schemas.microsoft.com/office/drawing/2017/model3d" xmlns:o="urn:schemas-microsoft-com:office:office" xmlns:r="http://schemas.openxmlformats.org/officeDocument/2006/relationships" xmlns:m="http://schemas.openxmlformats.org/officeDocument/2006/math" xmlns:v="urn:schemas-microsoft-com:vml" xmlns:wp14="http://schemas.microsoft.com/office/word/2010/wordprocessingDrawing" xmlns:wp="http://schemas.openxmlformats.org/drawingml/2006/wordprocessingDrawing" xmlns:w10="urn:schemas-microsoft-com:office:word" xmlns:w="http://schemas.openxmlformats.org/wordprocessingml/2006/main" xmlns:w14="http://schemas.microsoft.com/office/word/2010/wordml" xmlns:w15="http://schemas.microsoft.com/office/word/2012/wordml" xmlns:w16cid="http://schemas.microsoft.com/office/word/2016/wordml/cid" xmlns:w16se="http://schemas.microsoft.com/office/word/2015/wordml/symex" xmlns:wpg="http://schemas.microsoft.com/office/word/2010/wordprocessingGroup" xmlns:wpi="http://schemas.microsoft.com/office/word/2010/wordprocessingInk" xmlns:wne="http://schemas.microsoft.com/office/word/2006/wordml" xmlns:wps="http://schemas.microsoft.com/office/word/2010/wordprocessingShape" mc:Ignorable="w14 w15 w16se w16cid wp14">
+<w:numbering xmlns:wpc="http://schemas.microsoft.com/office/word/2010/wordprocessingCanvas" xmlns:cx="http://schemas.microsoft.com/office/drawing/2014/chartex" xmlns:cx1="http://schemas.microsoft.com/office/drawing/2015/9/8/chartex" xmlns:cx2="http://schemas.microsoft.com/office/drawing/2015/10/21/chartex" xmlns:cx3="http://schemas.microsoft.com/office/drawing/2016/5/9/chartex" xmlns:cx4="http://schemas.microsoft.com/office/drawing/2016/5/10/chartex" xmlns:cx5="http://schemas.microsoft.com/office/drawing/2016/5/11/chartex" xmlns:cx6="http://schemas.microsoft.com/office/drawing/2016/5/12/chartex" xmlns:cx7="http://schemas.microsoft.com/office/drawing/2016/5/13/chartex" xmlns:cx8="http://schemas.microsoft.com/office/drawing/2016/5/14/chartex" xmlns:mc="http://schemas.openxmlformats.org/markup-compatibility/2006" xmlns:aink="http://schemas.microsoft.com/office/drawing/2016/ink" xmlns:am3d="http://schemas.microsoft.com/office/drawing/2017/model3d" xmlns:o="urn:schemas-microsoft-com:office:office" xmlns:oel="http://schemas.microsoft.com/office/2019/extlst" xmlns:r="http://schemas.openxmlformats.org/officeDocument/2006/relationships" xmlns:m="http://schemas.openxmlformats.org/officeDocument/2006/math" xmlns:v="urn:schemas-microsoft-com:vml" xmlns:wp14="http://schemas.microsoft.com/office/word/2010/wordprocessingDrawing" xmlns:wp="http://schemas.openxmlformats.org/drawingml/2006/wordprocessingDrawing" xmlns:w10="urn:schemas-microsoft-com:office:word" xmlns:w="http://schemas.openxmlformats.org/wordprocessingml/2006/main" xmlns:w14="http://schemas.microsoft.com/office/word/2010/wordml" xmlns:w15="http://schemas.microsoft.com/office/word/2012/wordml" xmlns:w16cex="http://schemas.microsoft.com/office/word/2018/wordml/cex" xmlns:w16cid="http://schemas.microsoft.com/office/word/2016/wordml/cid" xmlns:w16="http://schemas.microsoft.com/office/word/2018/wordml" xmlns:w16du="http://schemas.microsoft.com/office/word/2023/wordml/word16du" xmlns:w16sdtdh="http://schemas.microsoft.com/office/word/2020/wordml/sdtdatahash" xmlns:w16sdtfl="http://schemas.microsoft.com/office/word/2024/wordml/sdtformatlock" xmlns:w16se="http://schemas.microsoft.com/office/word/2015/wordml/symex" xmlns:wpg="http://schemas.microsoft.com/office/word/2010/wordprocessingGroup" xmlns:wpi="http://schemas.microsoft.com/office/word/2010/wordprocessingInk" xmlns:wne="http://schemas.microsoft.com/office/word/2006/wordml" xmlns:wps="http://schemas.microsoft.com/office/word/2010/wordprocessingShape" mc:Ignorable="w14 w15 w16se w16cid w16 w16cex w16sdtdh w16sdtfl w16du wp14">
   <w:abstractNum w:abstractNumId="0" w15:restartNumberingAfterBreak="0">
     <w:nsid w:val="00BE2627"/>
     <w:multiLevelType w:val="hybridMultilevel"/>
@@ -15488,259 +15634,259 @@
       </w:rPr>
     </w:lvl>
   </w:abstractNum>
-  <w:num w:numId="1">
+  <w:num w:numId="1" w16cid:durableId="580718145">
     <w:abstractNumId w:val="9"/>
   </w:num>
-  <w:num w:numId="2">
+  <w:num w:numId="2" w16cid:durableId="101463345">
     <w:abstractNumId w:val="3"/>
   </w:num>
-  <w:num w:numId="3">
+  <w:num w:numId="3" w16cid:durableId="266276095">
     <w:abstractNumId w:val="59"/>
   </w:num>
-  <w:num w:numId="4">
+  <w:num w:numId="4" w16cid:durableId="1689211108">
     <w:abstractNumId w:val="9"/>
   </w:num>
-  <w:num w:numId="5">
+  <w:num w:numId="5" w16cid:durableId="2107311470">
     <w:abstractNumId w:val="67"/>
   </w:num>
-  <w:num w:numId="6">
+  <w:num w:numId="6" w16cid:durableId="579099835">
     <w:abstractNumId w:val="4"/>
   </w:num>
-  <w:num w:numId="7">
+  <w:num w:numId="7" w16cid:durableId="1515532631">
     <w:abstractNumId w:val="61"/>
   </w:num>
-  <w:num w:numId="8">
+  <w:num w:numId="8" w16cid:durableId="962737026">
     <w:abstractNumId w:val="68"/>
   </w:num>
-  <w:num w:numId="9">
+  <w:num w:numId="9" w16cid:durableId="1015349821">
     <w:abstractNumId w:val="27"/>
   </w:num>
-  <w:num w:numId="10">
+  <w:num w:numId="10" w16cid:durableId="1283269490">
     <w:abstractNumId w:val="60"/>
   </w:num>
-  <w:num w:numId="11">
+  <w:num w:numId="11" w16cid:durableId="1665163134">
     <w:abstractNumId w:val="82"/>
   </w:num>
-  <w:num w:numId="12">
+  <w:num w:numId="12" w16cid:durableId="1780754888">
     <w:abstractNumId w:val="35"/>
   </w:num>
-  <w:num w:numId="13">
+  <w:num w:numId="13" w16cid:durableId="721103349">
     <w:abstractNumId w:val="11"/>
   </w:num>
-  <w:num w:numId="14">
+  <w:num w:numId="14" w16cid:durableId="1964575126">
     <w:abstractNumId w:val="28"/>
   </w:num>
-  <w:num w:numId="15">
+  <w:num w:numId="15" w16cid:durableId="208155136">
     <w:abstractNumId w:val="47"/>
   </w:num>
-  <w:num w:numId="16">
+  <w:num w:numId="16" w16cid:durableId="1146043253">
     <w:abstractNumId w:val="41"/>
   </w:num>
-  <w:num w:numId="17">
+  <w:num w:numId="17" w16cid:durableId="205335709">
     <w:abstractNumId w:val="34"/>
   </w:num>
-  <w:num w:numId="18">
+  <w:num w:numId="18" w16cid:durableId="2011789580">
     <w:abstractNumId w:val="22"/>
   </w:num>
-  <w:num w:numId="19">
+  <w:num w:numId="19" w16cid:durableId="1209143273">
     <w:abstractNumId w:val="83"/>
   </w:num>
-  <w:num w:numId="20">
+  <w:num w:numId="20" w16cid:durableId="1664971932">
     <w:abstractNumId w:val="2"/>
   </w:num>
-  <w:num w:numId="21">
+  <w:num w:numId="21" w16cid:durableId="1091321135">
     <w:abstractNumId w:val="44"/>
   </w:num>
-  <w:num w:numId="22">
+  <w:num w:numId="22" w16cid:durableId="858396996">
     <w:abstractNumId w:val="76"/>
   </w:num>
-  <w:num w:numId="23">
+  <w:num w:numId="23" w16cid:durableId="2005626744">
     <w:abstractNumId w:val="71"/>
   </w:num>
-  <w:num w:numId="24">
+  <w:num w:numId="24" w16cid:durableId="1518956601">
     <w:abstractNumId w:val="54"/>
   </w:num>
-  <w:num w:numId="25">
+  <w:num w:numId="25" w16cid:durableId="793980139">
     <w:abstractNumId w:val="18"/>
   </w:num>
-  <w:num w:numId="26">
+  <w:num w:numId="26" w16cid:durableId="564098854">
     <w:abstractNumId w:val="16"/>
   </w:num>
-  <w:num w:numId="27">
+  <w:num w:numId="27" w16cid:durableId="1842162327">
     <w:abstractNumId w:val="0"/>
   </w:num>
-  <w:num w:numId="28">
+  <w:num w:numId="28" w16cid:durableId="1821574904">
     <w:abstractNumId w:val="48"/>
   </w:num>
-  <w:num w:numId="29">
+  <w:num w:numId="29" w16cid:durableId="1528450999">
     <w:abstractNumId w:val="66"/>
   </w:num>
-  <w:num w:numId="30">
+  <w:num w:numId="30" w16cid:durableId="121313738">
     <w:abstractNumId w:val="49"/>
   </w:num>
-  <w:num w:numId="31">
+  <w:num w:numId="31" w16cid:durableId="781192901">
     <w:abstractNumId w:val="45"/>
   </w:num>
-  <w:num w:numId="32">
+  <w:num w:numId="32" w16cid:durableId="1480464504">
     <w:abstractNumId w:val="50"/>
   </w:num>
-  <w:num w:numId="33">
+  <w:num w:numId="33" w16cid:durableId="965542780">
     <w:abstractNumId w:val="81"/>
   </w:num>
-  <w:num w:numId="34">
+  <w:num w:numId="34" w16cid:durableId="2090036566">
     <w:abstractNumId w:val="62"/>
   </w:num>
-  <w:num w:numId="35">
+  <w:num w:numId="35" w16cid:durableId="1183085929">
     <w:abstractNumId w:val="31"/>
   </w:num>
-  <w:num w:numId="36">
+  <w:num w:numId="36" w16cid:durableId="1674256060">
     <w:abstractNumId w:val="10"/>
   </w:num>
-  <w:num w:numId="37">
+  <w:num w:numId="37" w16cid:durableId="1234584984">
     <w:abstractNumId w:val="37"/>
   </w:num>
-  <w:num w:numId="38">
+  <w:num w:numId="38" w16cid:durableId="591470461">
     <w:abstractNumId w:val="14"/>
   </w:num>
-  <w:num w:numId="39">
+  <w:num w:numId="39" w16cid:durableId="816998014">
     <w:abstractNumId w:val="58"/>
   </w:num>
-  <w:num w:numId="40">
+  <w:num w:numId="40" w16cid:durableId="2070882558">
     <w:abstractNumId w:val="65"/>
   </w:num>
-  <w:num w:numId="41">
+  <w:num w:numId="41" w16cid:durableId="1072577778">
     <w:abstractNumId w:val="23"/>
   </w:num>
-  <w:num w:numId="42">
+  <w:num w:numId="42" w16cid:durableId="1521040786">
     <w:abstractNumId w:val="55"/>
   </w:num>
-  <w:num w:numId="43">
+  <w:num w:numId="43" w16cid:durableId="631443688">
     <w:abstractNumId w:val="21"/>
   </w:num>
-  <w:num w:numId="44">
+  <w:num w:numId="44" w16cid:durableId="2059620775">
     <w:abstractNumId w:val="56"/>
   </w:num>
-  <w:num w:numId="45">
+  <w:num w:numId="45" w16cid:durableId="2022313347">
     <w:abstractNumId w:val="79"/>
   </w:num>
-  <w:num w:numId="46">
+  <w:num w:numId="46" w16cid:durableId="55516710">
     <w:abstractNumId w:val="30"/>
   </w:num>
-  <w:num w:numId="47">
+  <w:num w:numId="47" w16cid:durableId="69424531">
     <w:abstractNumId w:val="42"/>
   </w:num>
-  <w:num w:numId="48">
+  <w:num w:numId="48" w16cid:durableId="326516143">
     <w:abstractNumId w:val="53"/>
   </w:num>
-  <w:num w:numId="49">
+  <w:num w:numId="49" w16cid:durableId="1824421145">
     <w:abstractNumId w:val="24"/>
   </w:num>
-  <w:num w:numId="50">
+  <w:num w:numId="50" w16cid:durableId="2031636431">
     <w:abstractNumId w:val="51"/>
   </w:num>
-  <w:num w:numId="51">
+  <w:num w:numId="51" w16cid:durableId="1801419828">
     <w:abstractNumId w:val="26"/>
   </w:num>
-  <w:num w:numId="52">
+  <w:num w:numId="52" w16cid:durableId="1766605906">
     <w:abstractNumId w:val="29"/>
   </w:num>
-  <w:num w:numId="53">
+  <w:num w:numId="53" w16cid:durableId="2013604106">
     <w:abstractNumId w:val="75"/>
   </w:num>
-  <w:num w:numId="54">
+  <w:num w:numId="54" w16cid:durableId="190729096">
     <w:abstractNumId w:val="43"/>
   </w:num>
-  <w:num w:numId="55">
+  <w:num w:numId="55" w16cid:durableId="312492752">
     <w:abstractNumId w:val="77"/>
   </w:num>
-  <w:num w:numId="56">
+  <w:num w:numId="56" w16cid:durableId="2022968981">
     <w:abstractNumId w:val="64"/>
   </w:num>
-  <w:num w:numId="57">
+  <w:num w:numId="57" w16cid:durableId="499390511">
     <w:abstractNumId w:val="5"/>
   </w:num>
-  <w:num w:numId="58">
+  <w:num w:numId="58" w16cid:durableId="1189367110">
     <w:abstractNumId w:val="78"/>
   </w:num>
-  <w:num w:numId="59">
+  <w:num w:numId="59" w16cid:durableId="373777932">
     <w:abstractNumId w:val="33"/>
   </w:num>
-  <w:num w:numId="60">
+  <w:num w:numId="60" w16cid:durableId="663438503">
     <w:abstractNumId w:val="69"/>
   </w:num>
-  <w:num w:numId="61">
+  <w:num w:numId="61" w16cid:durableId="1788500135">
     <w:abstractNumId w:val="15"/>
   </w:num>
-  <w:num w:numId="62">
+  <w:num w:numId="62" w16cid:durableId="755591981">
     <w:abstractNumId w:val="73"/>
   </w:num>
-  <w:num w:numId="63">
+  <w:num w:numId="63" w16cid:durableId="1810511879">
     <w:abstractNumId w:val="13"/>
   </w:num>
-  <w:num w:numId="64">
+  <w:num w:numId="64" w16cid:durableId="1991641160">
     <w:abstractNumId w:val="57"/>
   </w:num>
-  <w:num w:numId="65">
+  <w:num w:numId="65" w16cid:durableId="1107850403">
     <w:abstractNumId w:val="32"/>
   </w:num>
-  <w:num w:numId="66">
+  <w:num w:numId="66" w16cid:durableId="1424715871">
     <w:abstractNumId w:val="46"/>
   </w:num>
-  <w:num w:numId="67">
+  <w:num w:numId="67" w16cid:durableId="2069374523">
     <w:abstractNumId w:val="17"/>
   </w:num>
-  <w:num w:numId="68">
+  <w:num w:numId="68" w16cid:durableId="798230643">
     <w:abstractNumId w:val="38"/>
   </w:num>
-  <w:num w:numId="69">
+  <w:num w:numId="69" w16cid:durableId="398752150">
     <w:abstractNumId w:val="12"/>
   </w:num>
-  <w:num w:numId="70">
+  <w:num w:numId="70" w16cid:durableId="1920017574">
     <w:abstractNumId w:val="40"/>
   </w:num>
-  <w:num w:numId="71">
+  <w:num w:numId="71" w16cid:durableId="283004022">
     <w:abstractNumId w:val="63"/>
   </w:num>
-  <w:num w:numId="72">
+  <w:num w:numId="72" w16cid:durableId="1100569062">
     <w:abstractNumId w:val="80"/>
   </w:num>
-  <w:num w:numId="73">
+  <w:num w:numId="73" w16cid:durableId="338387385">
     <w:abstractNumId w:val="1"/>
   </w:num>
-  <w:num w:numId="74">
+  <w:num w:numId="74" w16cid:durableId="359627727">
     <w:abstractNumId w:val="39"/>
   </w:num>
-  <w:num w:numId="75">
+  <w:num w:numId="75" w16cid:durableId="1563103154">
     <w:abstractNumId w:val="70"/>
   </w:num>
-  <w:num w:numId="76">
+  <w:num w:numId="76" w16cid:durableId="1463813352">
     <w:abstractNumId w:val="8"/>
   </w:num>
-  <w:num w:numId="77">
+  <w:num w:numId="77" w16cid:durableId="728724199">
     <w:abstractNumId w:val="52"/>
   </w:num>
-  <w:num w:numId="78">
+  <w:num w:numId="78" w16cid:durableId="841973340">
     <w:abstractNumId w:val="20"/>
   </w:num>
-  <w:num w:numId="79">
+  <w:num w:numId="79" w16cid:durableId="1648166543">
     <w:abstractNumId w:val="25"/>
   </w:num>
-  <w:num w:numId="80">
+  <w:num w:numId="80" w16cid:durableId="2019766143">
     <w:abstractNumId w:val="19"/>
   </w:num>
-  <w:num w:numId="81">
+  <w:num w:numId="81" w16cid:durableId="1822186962">
     <w:abstractNumId w:val="74"/>
   </w:num>
-  <w:num w:numId="82">
+  <w:num w:numId="82" w16cid:durableId="1270821845">
     <w:abstractNumId w:val="72"/>
   </w:num>
-  <w:num w:numId="83">
+  <w:num w:numId="83" w16cid:durableId="651761819">
     <w:abstractNumId w:val="6"/>
   </w:num>
-  <w:num w:numId="84">
+  <w:num w:numId="84" w16cid:durableId="1669140332">
     <w:abstractNumId w:val="7"/>
   </w:num>
-  <w:num w:numId="85">
+  <w:num w:numId="85" w16cid:durableId="1129083383">
     <w:abstractNumId w:val="36"/>
   </w:num>
   <w:numIdMacAtCleanup w:val="85"/>
@@ -15748,7 +15894,7 @@
 </file>
 
 <file path=word/styles.xml><?xml version="1.0" encoding="utf-8"?>
-<w:styles xmlns:mc="http://schemas.openxmlformats.org/markup-compatibility/2006" xmlns:r="http://schemas.openxmlformats.org/officeDocument/2006/relationships" xmlns:w="http://schemas.openxmlformats.org/wordprocessingml/2006/main" xmlns:w14="http://schemas.microsoft.com/office/word/2010/wordml" xmlns:w15="http://schemas.microsoft.com/office/word/2012/wordml" xmlns:w16cid="http://schemas.microsoft.com/office/word/2016/wordml/cid" xmlns:w16se="http://schemas.microsoft.com/office/word/2015/wordml/symex" mc:Ignorable="w14 w15 w16se w16cid">
+<w:styles xmlns:mc="http://schemas.openxmlformats.org/markup-compatibility/2006" xmlns:r="http://schemas.openxmlformats.org/officeDocument/2006/relationships" xmlns:w="http://schemas.openxmlformats.org/wordprocessingml/2006/main" xmlns:w14="http://schemas.microsoft.com/office/word/2010/wordml" xmlns:w15="http://schemas.microsoft.com/office/word/2012/wordml" xmlns:w16cex="http://schemas.microsoft.com/office/word/2018/wordml/cex" xmlns:w16cid="http://schemas.microsoft.com/office/word/2016/wordml/cid" xmlns:w16="http://schemas.microsoft.com/office/word/2018/wordml" xmlns:w16du="http://schemas.microsoft.com/office/word/2023/wordml/word16du" xmlns:w16sdtdh="http://schemas.microsoft.com/office/word/2020/wordml/sdtdatahash" xmlns:w16sdtfl="http://schemas.microsoft.com/office/word/2024/wordml/sdtformatlock" xmlns:w16se="http://schemas.microsoft.com/office/word/2015/wordml/symex" mc:Ignorable="w14 w15 w16se w16cid w16 w16cex w16sdtdh w16sdtfl w16du">
   <w:docDefaults>
     <w:rPrDefault>
       <w:rPr>
@@ -15764,7 +15910,7 @@
       </w:pPr>
     </w:pPrDefault>
   </w:docDefaults>
-  <w:latentStyles w:defLockedState="0" w:defUIPriority="99" w:defSemiHidden="0" w:defUnhideWhenUsed="0" w:defQFormat="0" w:count="375">
+  <w:latentStyles w:defLockedState="0" w:defUIPriority="99" w:defSemiHidden="0" w:defUnhideWhenUsed="0" w:defQFormat="0" w:count="376">
     <w:lsdException w:name="Normal" w:uiPriority="0" w:qFormat="1"/>
     <w:lsdException w:name="heading 1" w:uiPriority="9" w:qFormat="1"/>
     <w:lsdException w:name="heading 2" w:semiHidden="1" w:uiPriority="9" w:unhideWhenUsed="1" w:qFormat="1"/>
@@ -16140,6 +16286,7 @@
     <w:lsdException w:name="Smart Hyperlink" w:semiHidden="1" w:unhideWhenUsed="1"/>
     <w:lsdException w:name="Hashtag" w:semiHidden="1" w:unhideWhenUsed="1"/>
     <w:lsdException w:name="Unresolved Mention" w:semiHidden="1" w:unhideWhenUsed="1"/>
+    <w:lsdException w:name="Smart Link" w:semiHidden="1" w:unhideWhenUsed="1"/>
   </w:latentStyles>
   <w:style w:type="paragraph" w:default="1" w:styleId="Normal">
     <w:name w:val="Normal"/>

</xml_diff>